<commit_message>
TS 7.3 Tamil Kramam corr wip
</commit_message>
<xml_diff>
--- a/TS-Kramam/TS-7.3/TS 7.3 Tamil Krama Paatam Corrections.docx
+++ b/TS-Kramam/TS-7.3/TS 7.3 Tamil Krama Paatam Corrections.docx
@@ -1,7 +1,789 @@
 
 <file path=word/document.xml><?xml version="1.0" encoding="utf-8"?>
-<w:document xmlns:wpc="http://schemas.microsoft.com/office/word/2010/wordprocessingCanvas" xmlns:cx="http://schemas.microsoft.com/office/drawing/2014/chartex" xmlns:cx1="http://schemas.microsoft.com/office/drawing/2015/9/8/chartex" xmlns:cx2="http://schemas.microsoft.com/office/drawing/2015/10/21/chartex" xmlns:cx3="http://schemas.microsoft.com/office/drawing/2016/5/9/chartex" xmlns:cx4="http://schemas.microsoft.com/office/drawing/2016/5/10/chartex" xmlns:cx5="http://schemas.microsoft.com/office/drawing/2016/5/11/chartex" xmlns:cx6="http://schemas.microsoft.com/office/drawing/2016/5/12/chartex" xmlns:cx7="http://schemas.microsoft.com/office/drawing/2016/5/13/chartex" xmlns:cx8="http://schemas.microsoft.com/office/drawing/2016/5/14/chartex" xmlns:mc="http://schemas.openxmlformats.org/markup-compatibility/2006" xmlns:aink="http://schemas.microsoft.com/office/drawing/2016/ink" xmlns:am3d="http://schemas.microsoft.com/office/drawing/2017/model3d" xmlns:o="urn:schemas-microsoft-com:office:office" xmlns:oel="http://schemas.microsoft.com/office/2019/extlst" xmlns:r="http://schemas.openxmlformats.org/officeDocument/2006/relationships" xmlns:m="http://schemas.openxmlformats.org/officeDocument/2006/math" xmlns:v="urn:schemas-microsoft-com:vml" xmlns:wp14="http://schemas.microsoft.com/office/word/2010/wordprocessingDrawing" xmlns:wp="http://schemas.openxmlformats.org/drawingml/2006/wordprocessingDrawing" xmlns:w10="urn:schemas-microsoft-com:office:word" xmlns:w="http://schemas.openxmlformats.org/wordprocessingml/2006/main" xmlns:w14="http://schemas.microsoft.com/office/word/2010/wordml" xmlns:w15="http://schemas.microsoft.com/office/word/2012/wordml" xmlns:w16cex="http://schemas.microsoft.com/office/word/2018/wordml/cex" xmlns:w16cid="http://schemas.microsoft.com/office/word/2016/wordml/cid" xmlns:w16="http://schemas.microsoft.com/office/word/2018/wordml" xmlns:w16sdtdh="http://schemas.microsoft.com/office/word/2020/wordml/sdtdatahash" xmlns:w16se="http://schemas.microsoft.com/office/word/2015/wordml/symex" xmlns:wpg="http://schemas.microsoft.com/office/word/2010/wordprocessingGroup" xmlns:wpi="http://schemas.microsoft.com/office/word/2010/wordprocessingInk" xmlns:wne="http://schemas.microsoft.com/office/word/2006/wordml" xmlns:wps="http://schemas.microsoft.com/office/word/2010/wordprocessingShape" mc:Ignorable="w14 w15 w16se w16cid w16 w16cex w16sdtdh wp14">
+<w:document xmlns:wpc="http://schemas.microsoft.com/office/word/2010/wordprocessingCanvas" xmlns:cx="http://schemas.microsoft.com/office/drawing/2014/chartex" xmlns:cx1="http://schemas.microsoft.com/office/drawing/2015/9/8/chartex" xmlns:cx2="http://schemas.microsoft.com/office/drawing/2015/10/21/chartex" xmlns:cx3="http://schemas.microsoft.com/office/drawing/2016/5/9/chartex" xmlns:cx4="http://schemas.microsoft.com/office/drawing/2016/5/10/chartex" xmlns:cx5="http://schemas.microsoft.com/office/drawing/2016/5/11/chartex" xmlns:cx6="http://schemas.microsoft.com/office/drawing/2016/5/12/chartex" xmlns:cx7="http://schemas.microsoft.com/office/drawing/2016/5/13/chartex" xmlns:cx8="http://schemas.microsoft.com/office/drawing/2016/5/14/chartex" xmlns:mc="http://schemas.openxmlformats.org/markup-compatibility/2006" xmlns:aink="http://schemas.microsoft.com/office/drawing/2016/ink" xmlns:am3d="http://schemas.microsoft.com/office/drawing/2017/model3d" xmlns:o="urn:schemas-microsoft-com:office:office" xmlns:oel="http://schemas.microsoft.com/office/2019/extlst" xmlns:r="http://schemas.openxmlformats.org/officeDocument/2006/relationships" xmlns:m="http://schemas.openxmlformats.org/officeDocument/2006/math" xmlns:v="urn:schemas-microsoft-com:vml" xmlns:wp14="http://schemas.microsoft.com/office/word/2010/wordprocessingDrawing" xmlns:wp="http://schemas.openxmlformats.org/drawingml/2006/wordprocessingDrawing" xmlns:w10="urn:schemas-microsoft-com:office:word" xmlns:w="http://schemas.openxmlformats.org/wordprocessingml/2006/main" xmlns:w14="http://schemas.microsoft.com/office/word/2010/wordml" xmlns:w15="http://schemas.microsoft.com/office/word/2012/wordml" xmlns:w16cex="http://schemas.microsoft.com/office/word/2018/wordml/cex" xmlns:w16cid="http://schemas.microsoft.com/office/word/2016/wordml/cid" xmlns:w16="http://schemas.microsoft.com/office/word/2018/wordml" xmlns:w16du="http://schemas.microsoft.com/office/word/2023/wordml/word16du" xmlns:w16sdtdh="http://schemas.microsoft.com/office/word/2020/wordml/sdtdatahash" xmlns:w16sdtfl="http://schemas.microsoft.com/office/word/2024/wordml/sdtformatlock" xmlns:w16se="http://schemas.microsoft.com/office/word/2015/wordml/symex" xmlns:wpg="http://schemas.microsoft.com/office/word/2010/wordprocessingGroup" xmlns:wpi="http://schemas.microsoft.com/office/word/2010/wordprocessingInk" xmlns:wne="http://schemas.microsoft.com/office/word/2006/wordml" xmlns:wps="http://schemas.microsoft.com/office/word/2010/wordprocessingShape" mc:Ignorable="w14 w15 w16se w16cid w16 w16cex w16sdtdh w16sdtfl w16du wp14">
   <w:body>
+    <w:p>
+      <w:pPr>
+        <w:jc w:val="center"/>
+        <w:rPr>
+          <w:b/>
+          <w:bCs/>
+          <w:color w:val="EE0000"/>
+          <w:sz w:val="32"/>
+          <w:szCs w:val="32"/>
+          <w:u w:val="single"/>
+        </w:rPr>
+      </w:pPr>
+      <w:r>
+        <w:rPr>
+          <w:b/>
+          <w:bCs/>
+          <w:sz w:val="32"/>
+          <w:szCs w:val="32"/>
+          <w:u w:val="single"/>
+        </w:rPr>
+        <w:t xml:space="preserve">TS </w:t>
+      </w:r>
+      <w:r>
+        <w:rPr>
+          <w:b/>
+          <w:bCs/>
+          <w:sz w:val="32"/>
+          <w:szCs w:val="32"/>
+          <w:u w:val="single"/>
+        </w:rPr>
+        <w:t>Krama</w:t>
+      </w:r>
+      <w:r>
+        <w:rPr>
+          <w:b/>
+          <w:bCs/>
+          <w:sz w:val="32"/>
+          <w:szCs w:val="32"/>
+          <w:u w:val="single"/>
+        </w:rPr>
+        <w:t xml:space="preserve"> Paatam – TS </w:t>
+      </w:r>
+      <w:r>
+        <w:rPr>
+          <w:b/>
+          <w:bCs/>
+          <w:sz w:val="32"/>
+          <w:szCs w:val="32"/>
+          <w:u w:val="single"/>
+        </w:rPr>
+        <w:t>7.3 Tamil</w:t>
+      </w:r>
+      <w:r>
+        <w:rPr>
+          <w:b/>
+          <w:bCs/>
+          <w:sz w:val="32"/>
+          <w:szCs w:val="32"/>
+          <w:u w:val="single"/>
+        </w:rPr>
+        <w:t xml:space="preserve"> Corrections –</w:t>
+      </w:r>
+      <w:r>
+        <w:rPr>
+          <w:b/>
+          <w:bCs/>
+          <w:sz w:val="32"/>
+          <w:szCs w:val="32"/>
+          <w:u w:val="single"/>
+        </w:rPr>
+        <w:t xml:space="preserve"> </w:t>
+      </w:r>
+      <w:r>
+        <w:rPr>
+          <w:b/>
+          <w:bCs/>
+          <w:sz w:val="32"/>
+          <w:szCs w:val="32"/>
+          <w:u w:val="single"/>
+        </w:rPr>
+        <w:t xml:space="preserve">Observed till </w:t>
+      </w:r>
+      <w:r>
+        <w:rPr>
+          <w:b/>
+          <w:bCs/>
+          <w:color w:val="EE0000"/>
+          <w:sz w:val="32"/>
+          <w:szCs w:val="32"/>
+          <w:u w:val="single"/>
+        </w:rPr>
+        <w:t>xxxxxxxxx</w:t>
+      </w:r>
+    </w:p>
+    <w:p>
+      <w:pPr>
+        <w:jc w:val="center"/>
+        <w:rPr>
+          <w:b/>
+          <w:bCs/>
+        </w:rPr>
+      </w:pPr>
+      <w:r>
+        <w:rPr>
+          <w:b/>
+          <w:bCs/>
+        </w:rPr>
+        <w:t>(ignore those which are already incorporated in your book’s version and date)</w:t>
+      </w:r>
+    </w:p>
+    <w:tbl>
+      <w:tblPr>
+        <w:tblW w:w="13970" w:type="dxa"/>
+        <w:tblInd w:w="-792" w:type="dxa"/>
+        <w:tblBorders>
+          <w:top w:val="single" w:sz="4" w:space="0" w:color="000000"/>
+          <w:left w:val="single" w:sz="4" w:space="0" w:color="000000"/>
+          <w:bottom w:val="single" w:sz="4" w:space="0" w:color="000000"/>
+          <w:right w:val="single" w:sz="4" w:space="0" w:color="000000"/>
+          <w:insideH w:val="single" w:sz="4" w:space="0" w:color="000000"/>
+          <w:insideV w:val="single" w:sz="4" w:space="0" w:color="000000"/>
+        </w:tblBorders>
+        <w:tblLook w:val="04A0" w:firstRow="1" w:lastRow="0" w:firstColumn="1" w:lastColumn="0" w:noHBand="0" w:noVBand="1"/>
+      </w:tblPr>
+      <w:tblGrid>
+        <w:gridCol w:w="3877"/>
+        <w:gridCol w:w="4738"/>
+        <w:gridCol w:w="5355"/>
+      </w:tblGrid>
+      <w:tr>
+        <w:tc>
+          <w:tcPr>
+            <w:tcW w:w="3877" w:type="dxa"/>
+          </w:tcPr>
+          <w:p>
+            <w:pPr>
+              <w:spacing w:before="0" w:line="240" w:lineRule="auto"/>
+              <w:jc w:val="center"/>
+              <w:rPr>
+                <w:b/>
+                <w:bCs/>
+                <w:sz w:val="32"/>
+                <w:szCs w:val="32"/>
+              </w:rPr>
+            </w:pPr>
+            <w:r>
+              <w:rPr>
+                <w:b/>
+                <w:bCs/>
+                <w:sz w:val="32"/>
+                <w:szCs w:val="32"/>
+              </w:rPr>
+              <w:t>Section, Paragraph</w:t>
+            </w:r>
+          </w:p>
+          <w:p>
+            <w:pPr>
+              <w:spacing w:before="0" w:line="240" w:lineRule="auto"/>
+              <w:jc w:val="center"/>
+              <w:rPr>
+                <w:b/>
+                <w:bCs/>
+                <w:sz w:val="32"/>
+                <w:szCs w:val="32"/>
+              </w:rPr>
+            </w:pPr>
+            <w:r>
+              <w:rPr>
+                <w:b/>
+                <w:bCs/>
+                <w:sz w:val="32"/>
+                <w:szCs w:val="32"/>
+              </w:rPr>
+              <w:t>Reference</w:t>
+            </w:r>
+          </w:p>
+        </w:tc>
+        <w:tc>
+          <w:tcPr>
+            <w:tcW w:w="4738" w:type="dxa"/>
+          </w:tcPr>
+          <w:p>
+            <w:pPr>
+              <w:spacing w:before="0" w:line="240" w:lineRule="auto"/>
+              <w:jc w:val="center"/>
+              <w:rPr>
+                <w:b/>
+                <w:bCs/>
+                <w:sz w:val="32"/>
+                <w:szCs w:val="32"/>
+              </w:rPr>
+            </w:pPr>
+            <w:r>
+              <w:rPr>
+                <w:b/>
+                <w:bCs/>
+                <w:sz w:val="32"/>
+                <w:szCs w:val="32"/>
+              </w:rPr>
+              <w:t>As Printed</w:t>
+            </w:r>
+          </w:p>
+        </w:tc>
+        <w:tc>
+          <w:tcPr>
+            <w:tcW w:w="5355" w:type="dxa"/>
+          </w:tcPr>
+          <w:p>
+            <w:pPr>
+              <w:spacing w:before="0" w:line="240" w:lineRule="auto"/>
+              <w:ind w:right="-18"/>
+              <w:jc w:val="center"/>
+              <w:rPr>
+                <w:b/>
+                <w:bCs/>
+                <w:sz w:val="32"/>
+                <w:szCs w:val="32"/>
+              </w:rPr>
+            </w:pPr>
+            <w:r>
+              <w:rPr>
+                <w:b/>
+                <w:bCs/>
+                <w:sz w:val="32"/>
+                <w:szCs w:val="32"/>
+              </w:rPr>
+              <w:t>To be read as or corrected as</w:t>
+            </w:r>
+          </w:p>
+        </w:tc>
+      </w:tr>
+      <w:tr>
+        <w:trPr>
+          <w:trHeight w:val="680"/>
+        </w:trPr>
+        <w:tc>
+          <w:tcPr>
+            <w:tcW w:w="3877" w:type="dxa"/>
+          </w:tcPr>
+          <w:p>
+            <w:pPr>
+              <w:widowControl w:val="0"/>
+              <w:autoSpaceDE w:val="0"/>
+              <w:autoSpaceDN w:val="0"/>
+              <w:adjustRightInd w:val="0"/>
+              <w:spacing w:before="0" w:line="264" w:lineRule="auto"/>
+              <w:rPr>
+                <w:rFonts w:cs="Arial"/>
+                <w:b/>
+                <w:sz w:val="28"/>
+                <w:szCs w:val="28"/>
+              </w:rPr>
+            </w:pPr>
+            <w:r>
+              <w:rPr>
+                <w:rFonts w:cs="Arial"/>
+                <w:b/>
+                <w:sz w:val="28"/>
+                <w:szCs w:val="28"/>
+              </w:rPr>
+              <w:t>TS 7.3,7.2 - Kramam</w:t>
+            </w:r>
+          </w:p>
+          <w:p>
+            <w:pPr>
+              <w:widowControl w:val="0"/>
+              <w:autoSpaceDE w:val="0"/>
+              <w:autoSpaceDN w:val="0"/>
+              <w:adjustRightInd w:val="0"/>
+              <w:spacing w:before="0" w:line="264" w:lineRule="auto"/>
+              <w:rPr>
+                <w:rFonts w:cs="Arial"/>
+                <w:b/>
+                <w:sz w:val="28"/>
+                <w:szCs w:val="28"/>
+              </w:rPr>
+            </w:pPr>
+            <w:r>
+              <w:rPr>
+                <w:rFonts w:cs="Arial"/>
+                <w:b/>
+                <w:sz w:val="28"/>
+                <w:szCs w:val="28"/>
+              </w:rPr>
+              <w:t>Krama Vaakyam-</w:t>
+            </w:r>
+            <w:r>
+              <w:rPr>
+                <w:rFonts w:cs="Arial"/>
+                <w:b/>
+                <w:sz w:val="28"/>
+                <w:szCs w:val="28"/>
+              </w:rPr>
+              <w:t xml:space="preserve"> 15 to 21</w:t>
+            </w:r>
+          </w:p>
+          <w:p>
+            <w:pPr>
+              <w:widowControl w:val="0"/>
+              <w:autoSpaceDE w:val="0"/>
+              <w:autoSpaceDN w:val="0"/>
+              <w:adjustRightInd w:val="0"/>
+              <w:spacing w:before="0" w:line="264" w:lineRule="auto"/>
+              <w:rPr>
+                <w:rFonts w:cs="Arial"/>
+                <w:b/>
+                <w:sz w:val="28"/>
+                <w:szCs w:val="28"/>
+              </w:rPr>
+            </w:pPr>
+            <w:r>
+              <w:rPr>
+                <w:rFonts w:cs="Arial"/>
+                <w:b/>
+                <w:sz w:val="28"/>
+                <w:szCs w:val="28"/>
+              </w:rPr>
+              <w:t>39 to 44</w:t>
+            </w:r>
+          </w:p>
+          <w:p>
+            <w:pPr>
+              <w:widowControl w:val="0"/>
+              <w:autoSpaceDE w:val="0"/>
+              <w:autoSpaceDN w:val="0"/>
+              <w:adjustRightInd w:val="0"/>
+              <w:spacing w:before="0" w:line="264" w:lineRule="auto"/>
+              <w:rPr>
+                <w:rFonts w:cs="Arial"/>
+                <w:b/>
+                <w:sz w:val="28"/>
+                <w:szCs w:val="28"/>
+                <w:lang w:val="en-IN"/>
+              </w:rPr>
+            </w:pPr>
+            <w:r>
+              <w:rPr>
+                <w:rFonts w:cs="Arial"/>
+                <w:b/>
+                <w:sz w:val="28"/>
+                <w:szCs w:val="28"/>
+              </w:rPr>
+              <w:t xml:space="preserve">Panchaati No: </w:t>
+            </w:r>
+            <w:r>
+              <w:rPr>
+                <w:rFonts w:cs="Arial"/>
+                <w:b/>
+                <w:sz w:val="28"/>
+                <w:szCs w:val="28"/>
+                <w:lang w:val="en-IN"/>
+              </w:rPr>
+              <w:t>17</w:t>
+            </w:r>
+          </w:p>
+          <w:p>
+            <w:pPr>
+              <w:widowControl w:val="0"/>
+              <w:autoSpaceDE w:val="0"/>
+              <w:autoSpaceDN w:val="0"/>
+              <w:adjustRightInd w:val="0"/>
+              <w:spacing w:before="0" w:line="264" w:lineRule="auto"/>
+              <w:rPr>
+                <w:rFonts w:cs="Arial"/>
+                <w:bCs/>
+                <w:sz w:val="32"/>
+                <w:szCs w:val="36"/>
+                <w:lang w:val="en-IN"/>
+              </w:rPr>
+            </w:pPr>
+            <w:r>
+              <w:rPr>
+                <w:rFonts w:cs="Arial"/>
+                <w:b/>
+                <w:bCs/>
+                <w:sz w:val="32"/>
+                <w:szCs w:val="36"/>
+                <w:lang w:val="en-IN"/>
+              </w:rPr>
+              <w:t>Word arddhamAsa</w:t>
+            </w:r>
+          </w:p>
+        </w:tc>
+        <w:tc>
+          <w:tcPr>
+            <w:tcW w:w="4738" w:type="dxa"/>
+          </w:tcPr>
+          <w:p>
+            <w:pPr>
+              <w:widowControl w:val="0"/>
+              <w:autoSpaceDE w:val="0"/>
+              <w:autoSpaceDN w:val="0"/>
+              <w:adjustRightInd w:val="0"/>
+              <w:spacing w:before="0" w:line="264" w:lineRule="auto"/>
+              <w:rPr>
+                <w:rFonts w:cs="Arial"/>
+                <w:bCs/>
+                <w:sz w:val="32"/>
+                <w:szCs w:val="36"/>
+              </w:rPr>
+            </w:pPr>
+            <w:r>
+              <w:rPr>
+                <w:rFonts w:ascii="Latha" w:hAnsi="Latha" w:cs="Latha"/>
+                <w:sz w:val="28"/>
+                <w:szCs w:val="28"/>
+                <w:cs/>
+                <w:lang w:bidi="ta-IN"/>
+              </w:rPr>
+              <w:t>அ</w:t>
+            </w:r>
+            <w:r>
+              <w:rPr>
+                <w:rFonts w:ascii="BRH Tamil Tab Extra" w:hAnsi="BRH Tamil Tab Extra" w:cs="Latha"/>
+                <w:b/>
+                <w:sz w:val="36"/>
+                <w:szCs w:val="28"/>
+                <w:lang w:bidi="ta-IN"/>
+              </w:rPr>
+              <w:t>†</w:t>
+            </w:r>
+            <w:r>
+              <w:rPr>
+                <w:rFonts w:ascii="Latha" w:hAnsi="Latha" w:cs="Latha"/>
+                <w:sz w:val="28"/>
+                <w:szCs w:val="28"/>
+                <w:cs/>
+                <w:lang w:bidi="ta-IN"/>
+              </w:rPr>
+              <w:t>ர்</w:t>
+            </w:r>
+            <w:r>
+              <w:rPr>
+                <w:rFonts w:ascii="Latha" w:hAnsi="Latha" w:cs="Latha"/>
+                <w:sz w:val="28"/>
+                <w:szCs w:val="28"/>
+                <w:highlight w:val="yellow"/>
+                <w:cs/>
+                <w:lang w:bidi="ta-IN"/>
+              </w:rPr>
+              <w:t>த</w:t>
+            </w:r>
+            <w:r>
+              <w:rPr>
+                <w:rFonts w:ascii="Latha" w:hAnsi="Latha" w:cs="Latha" w:hint="cs"/>
+                <w:b/>
+                <w:bCs/>
+                <w:position w:val="-12"/>
+                <w:sz w:val="28"/>
+                <w:szCs w:val="28"/>
+                <w:highlight w:val="yellow"/>
+                <w:cs/>
+                <w:lang w:bidi="ta-IN"/>
+              </w:rPr>
+              <w:t>3</w:t>
+            </w:r>
+            <w:r>
+              <w:rPr>
+                <w:rFonts w:ascii="Latha" w:hAnsi="Latha" w:cs="Latha"/>
+                <w:sz w:val="28"/>
+                <w:szCs w:val="28"/>
+                <w:highlight w:val="yellow"/>
+                <w:cs/>
+                <w:lang w:bidi="ta-IN"/>
+              </w:rPr>
+              <w:t>த</w:t>
+            </w:r>
+            <w:r>
+              <w:rPr>
+                <w:rFonts w:ascii="Latha" w:hAnsi="Latha" w:cs="Latha"/>
+                <w:b/>
+                <w:bCs/>
+                <w:position w:val="-12"/>
+                <w:sz w:val="28"/>
+                <w:szCs w:val="28"/>
+                <w:highlight w:val="yellow"/>
+                <w:cs/>
+                <w:lang w:bidi="ta-IN"/>
+              </w:rPr>
+              <w:t>4</w:t>
+            </w:r>
+            <w:r>
+              <w:rPr>
+                <w:rFonts w:ascii="Latha" w:hAnsi="Latha" w:cs="Latha"/>
+                <w:sz w:val="28"/>
+                <w:szCs w:val="28"/>
+                <w:cs/>
+                <w:lang w:bidi="ta-IN"/>
+              </w:rPr>
+              <w:t>மா</w:t>
+            </w:r>
+            <w:r>
+              <w:rPr>
+                <w:rFonts w:ascii="BRH Tamil Tab Extra" w:hAnsi="BRH Tamil Tab Extra" w:cs="Latha"/>
+                <w:b/>
+                <w:sz w:val="32"/>
+                <w:szCs w:val="28"/>
+                <w:lang w:bidi="ta-IN"/>
+              </w:rPr>
+              <w:t>…</w:t>
+            </w:r>
+            <w:r>
+              <w:rPr>
+                <w:rFonts w:ascii="Latha" w:hAnsi="Latha" w:cs="Latha"/>
+                <w:sz w:val="28"/>
+                <w:szCs w:val="28"/>
+                <w:cs/>
+                <w:lang w:bidi="ta-IN"/>
+              </w:rPr>
+              <w:t>ஸ</w:t>
+            </w:r>
+          </w:p>
+        </w:tc>
+        <w:tc>
+          <w:tcPr>
+            <w:tcW w:w="5355" w:type="dxa"/>
+          </w:tcPr>
+          <w:p>
+            <w:pPr>
+              <w:widowControl w:val="0"/>
+              <w:autoSpaceDE w:val="0"/>
+              <w:autoSpaceDN w:val="0"/>
+              <w:adjustRightInd w:val="0"/>
+              <w:spacing w:before="0" w:line="264" w:lineRule="auto"/>
+              <w:rPr>
+                <w:rFonts w:ascii="Latha" w:hAnsi="Latha" w:cs="Latha"/>
+                <w:sz w:val="28"/>
+                <w:szCs w:val="28"/>
+                <w:lang w:bidi="ta-IN"/>
+              </w:rPr>
+            </w:pPr>
+            <w:r>
+              <w:rPr>
+                <w:rFonts w:ascii="Latha" w:hAnsi="Latha" w:cs="Latha"/>
+                <w:sz w:val="28"/>
+                <w:szCs w:val="28"/>
+                <w:cs/>
+                <w:lang w:bidi="ta-IN"/>
+              </w:rPr>
+              <w:t>அ</w:t>
+            </w:r>
+            <w:r>
+              <w:rPr>
+                <w:rFonts w:ascii="BRH Tamil Tab Extra" w:hAnsi="BRH Tamil Tab Extra" w:cs="Latha"/>
+                <w:b/>
+                <w:sz w:val="36"/>
+                <w:szCs w:val="28"/>
+                <w:lang w:bidi="ta-IN"/>
+              </w:rPr>
+              <w:t>†</w:t>
+            </w:r>
+            <w:r>
+              <w:rPr>
+                <w:rFonts w:ascii="Latha" w:hAnsi="Latha" w:cs="Latha"/>
+                <w:sz w:val="28"/>
+                <w:szCs w:val="28"/>
+                <w:cs/>
+                <w:lang w:bidi="ta-IN"/>
+              </w:rPr>
+              <w:t>ர்</w:t>
+            </w:r>
+            <w:r>
+              <w:rPr>
+                <w:rFonts w:ascii="Latha" w:hAnsi="Latha" w:cs="Latha" w:hint="cs"/>
+                <w:sz w:val="28"/>
+                <w:szCs w:val="28"/>
+                <w:highlight w:val="green"/>
+                <w:cs/>
+                <w:lang w:bidi="ta-IN"/>
+              </w:rPr>
+              <w:t>த்</w:t>
+            </w:r>
+            <w:r>
+              <w:rPr>
+                <w:rFonts w:ascii="Latha" w:hAnsi="Latha" w:cs="Latha" w:hint="cs"/>
+                <w:b/>
+                <w:bCs/>
+                <w:position w:val="-12"/>
+                <w:sz w:val="28"/>
+                <w:szCs w:val="28"/>
+                <w:highlight w:val="green"/>
+                <w:cs/>
+                <w:lang w:bidi="ta-IN"/>
+              </w:rPr>
+              <w:t>3</w:t>
+            </w:r>
+            <w:r>
+              <w:rPr>
+                <w:rFonts w:ascii="Latha" w:hAnsi="Latha" w:cs="Latha"/>
+                <w:sz w:val="28"/>
+                <w:szCs w:val="28"/>
+                <w:highlight w:val="green"/>
+                <w:cs/>
+                <w:lang w:bidi="ta-IN"/>
+              </w:rPr>
+              <w:t>த</w:t>
+            </w:r>
+            <w:r>
+              <w:rPr>
+                <w:rFonts w:ascii="Latha" w:hAnsi="Latha" w:cs="Latha"/>
+                <w:b/>
+                <w:bCs/>
+                <w:position w:val="-12"/>
+                <w:sz w:val="28"/>
+                <w:szCs w:val="28"/>
+                <w:highlight w:val="green"/>
+                <w:cs/>
+                <w:lang w:bidi="ta-IN"/>
+              </w:rPr>
+              <w:t>4</w:t>
+            </w:r>
+            <w:r>
+              <w:rPr>
+                <w:rFonts w:ascii="Latha" w:hAnsi="Latha" w:cs="Latha"/>
+                <w:sz w:val="28"/>
+                <w:szCs w:val="28"/>
+                <w:highlight w:val="yellow"/>
+                <w:cs/>
+                <w:lang w:bidi="ta-IN"/>
+              </w:rPr>
+              <w:t>மா</w:t>
+            </w:r>
+            <w:r>
+              <w:rPr>
+                <w:rFonts w:ascii="BRH Tamil Tab Extra" w:hAnsi="BRH Tamil Tab Extra" w:cs="Latha"/>
+                <w:b/>
+                <w:sz w:val="32"/>
+                <w:szCs w:val="28"/>
+                <w:lang w:bidi="ta-IN"/>
+              </w:rPr>
+              <w:t>…</w:t>
+            </w:r>
+            <w:r>
+              <w:rPr>
+                <w:rFonts w:ascii="Latha" w:hAnsi="Latha" w:cs="Latha"/>
+                <w:sz w:val="28"/>
+                <w:szCs w:val="28"/>
+                <w:cs/>
+                <w:lang w:bidi="ta-IN"/>
+              </w:rPr>
+              <w:t>ஸ</w:t>
+            </w:r>
+          </w:p>
+          <w:p>
+            <w:pPr>
+              <w:widowControl w:val="0"/>
+              <w:autoSpaceDE w:val="0"/>
+              <w:autoSpaceDN w:val="0"/>
+              <w:adjustRightInd w:val="0"/>
+              <w:spacing w:before="0" w:line="264" w:lineRule="auto"/>
+              <w:rPr>
+                <w:rFonts w:cs="Arial"/>
+                <w:bCs/>
+                <w:sz w:val="32"/>
+                <w:szCs w:val="36"/>
+              </w:rPr>
+            </w:pPr>
+            <w:r>
+              <w:rPr>
+                <w:rFonts w:cs="Arial"/>
+                <w:sz w:val="28"/>
+                <w:szCs w:val="28"/>
+                <w:lang w:bidi="ta-IN"/>
+              </w:rPr>
+              <w:t xml:space="preserve">The dot over first </w:t>
+            </w:r>
+            <w:r>
+              <w:rPr>
+                <w:rFonts w:ascii="Latha" w:hAnsi="Latha" w:cs="Latha" w:hint="cs"/>
+                <w:sz w:val="28"/>
+                <w:szCs w:val="28"/>
+                <w:highlight w:val="green"/>
+                <w:cs/>
+                <w:lang w:bidi="ta-IN"/>
+              </w:rPr>
+              <w:t>த்</w:t>
+            </w:r>
+            <w:r>
+              <w:rPr>
+                <w:rFonts w:ascii="Latha" w:hAnsi="Latha" w:cs="Latha" w:hint="cs"/>
+                <w:b/>
+                <w:bCs/>
+                <w:position w:val="-12"/>
+                <w:sz w:val="28"/>
+                <w:szCs w:val="28"/>
+                <w:highlight w:val="green"/>
+                <w:cs/>
+                <w:lang w:bidi="ta-IN"/>
+              </w:rPr>
+              <w:t>3</w:t>
+            </w:r>
+            <w:r>
+              <w:rPr>
+                <w:rFonts w:cs="Arial"/>
+                <w:sz w:val="28"/>
+                <w:szCs w:val="28"/>
+                <w:lang w:bidi="ta-IN"/>
+              </w:rPr>
+              <w:t xml:space="preserve"> is missing in </w:t>
+            </w:r>
+            <w:r>
+              <w:rPr>
+                <w:rFonts w:cs="Arial"/>
+                <w:sz w:val="28"/>
+                <w:szCs w:val="28"/>
+                <w:lang w:bidi="ta-IN"/>
+              </w:rPr>
+              <w:t xml:space="preserve">16 </w:t>
+            </w:r>
+            <w:r>
+              <w:rPr>
+                <w:rFonts w:cs="Arial"/>
+                <w:sz w:val="28"/>
+                <w:szCs w:val="28"/>
+                <w:lang w:bidi="ta-IN"/>
+              </w:rPr>
+              <w:t>statements</w:t>
+            </w:r>
+          </w:p>
+        </w:tc>
+      </w:tr>
+    </w:tbl>
+    <w:p>
+      <w:pPr>
+        <w:jc w:val="center"/>
+        <w:rPr>
+          <w:b/>
+          <w:bCs/>
+          <w:sz w:val="32"/>
+          <w:szCs w:val="32"/>
+          <w:u w:val="single"/>
+        </w:rPr>
+      </w:pPr>
+    </w:p>
+    <w:p>
+      <w:pPr>
+        <w:jc w:val="center"/>
+        <w:rPr>
+          <w:b/>
+          <w:bCs/>
+          <w:sz w:val="32"/>
+          <w:szCs w:val="32"/>
+          <w:u w:val="single"/>
+        </w:rPr>
+      </w:pPr>
+    </w:p>
+    <w:p>
+      <w:pPr>
+        <w:jc w:val="center"/>
+        <w:rPr>
+          <w:b/>
+          <w:bCs/>
+          <w:sz w:val="32"/>
+          <w:szCs w:val="32"/>
+          <w:u w:val="single"/>
+        </w:rPr>
+      </w:pPr>
+    </w:p>
+    <w:p>
+      <w:pPr>
+        <w:jc w:val="center"/>
+        <w:rPr>
+          <w:b/>
+          <w:bCs/>
+          <w:sz w:val="32"/>
+          <w:szCs w:val="32"/>
+          <w:u w:val="single"/>
+        </w:rPr>
+      </w:pPr>
+    </w:p>
+    <w:p>
+      <w:pPr>
+        <w:jc w:val="center"/>
+        <w:rPr>
+          <w:b/>
+          <w:bCs/>
+          <w:sz w:val="32"/>
+          <w:szCs w:val="32"/>
+          <w:u w:val="single"/>
+        </w:rPr>
+      </w:pPr>
+    </w:p>
     <w:p>
       <w:pPr>
         <w:jc w:val="center"/>
@@ -128,23 +910,7 @@
           <w:b/>
           <w:bCs/>
         </w:rPr>
-        <w:t>(</w:t>
-      </w:r>
-      <w:proofErr w:type="gramStart"/>
-      <w:r>
-        <w:rPr>
-          <w:b/>
-          <w:bCs/>
-        </w:rPr>
-        <w:t>ignore</w:t>
-      </w:r>
-      <w:proofErr w:type="gramEnd"/>
-      <w:r>
-        <w:rPr>
-          <w:b/>
-          <w:bCs/>
-        </w:rPr>
-        <w:t xml:space="preserve"> those which are already incorporated in your book’s version and date)</w:t>
+        <w:t>(ignore those which are already incorporated in your book’s version and date)</w:t>
       </w:r>
     </w:p>
     <w:tbl>
@@ -386,6 +1152,7 @@
           <w:szCs w:val="32"/>
           <w:u w:val="single"/>
         </w:rPr>
+        <w:lastRenderedPageBreak/>
         <w:t>==============</w:t>
       </w:r>
     </w:p>
@@ -545,23 +1312,7 @@
           <w:b/>
           <w:bCs/>
         </w:rPr>
-        <w:t>(</w:t>
-      </w:r>
-      <w:proofErr w:type="gramStart"/>
-      <w:r>
-        <w:rPr>
-          <w:b/>
-          <w:bCs/>
-        </w:rPr>
-        <w:t>ignore</w:t>
-      </w:r>
-      <w:proofErr w:type="gramEnd"/>
-      <w:r>
-        <w:rPr>
-          <w:b/>
-          <w:bCs/>
-        </w:rPr>
-        <w:t xml:space="preserve"> those which are already incorporated in your book’s version and date)</w:t>
+        <w:t>(ignore those which are already incorporated in your book’s version and date)</w:t>
       </w:r>
     </w:p>
     <w:tbl>
@@ -2382,7 +3133,6 @@
                 <w:sz w:val="28"/>
                 <w:szCs w:val="32"/>
               </w:rPr>
-              <w:lastRenderedPageBreak/>
               <w:t>T.S.7.3.5.3 – Kramam</w:t>
             </w:r>
           </w:p>
@@ -3444,6 +4194,7 @@
                 <w:sz w:val="28"/>
                 <w:szCs w:val="32"/>
               </w:rPr>
+              <w:lastRenderedPageBreak/>
               <w:t>T.S.</w:t>
             </w:r>
             <w:r>
@@ -5928,7 +6679,6 @@
                 <w:sz w:val="28"/>
                 <w:szCs w:val="32"/>
               </w:rPr>
-              <w:lastRenderedPageBreak/>
               <w:t>T.S.7.3.10.2 – Kramam</w:t>
             </w:r>
           </w:p>
@@ -6987,6 +7737,7 @@
                 <w:sz w:val="28"/>
                 <w:szCs w:val="32"/>
               </w:rPr>
+              <w:lastRenderedPageBreak/>
               <w:t>T.S.7.3.10.4 – Kramam</w:t>
             </w:r>
           </w:p>
@@ -9565,7 +10316,6 @@
                 <w:sz w:val="28"/>
                 <w:szCs w:val="32"/>
               </w:rPr>
-              <w:lastRenderedPageBreak/>
               <w:t>T.S.7.3.16.1 – Kramam</w:t>
             </w:r>
           </w:p>
@@ -10516,6 +11266,7 @@
           <w:szCs w:val="32"/>
           <w:u w:val="single"/>
         </w:rPr>
+        <w:lastRenderedPageBreak/>
         <w:t xml:space="preserve">TS </w:t>
       </w:r>
       <w:r>
@@ -10673,23 +11424,7 @@
           <w:b/>
           <w:bCs/>
         </w:rPr>
-        <w:t>(</w:t>
-      </w:r>
-      <w:proofErr w:type="gramStart"/>
-      <w:r>
-        <w:rPr>
-          <w:b/>
-          <w:bCs/>
-        </w:rPr>
-        <w:t>ignore</w:t>
-      </w:r>
-      <w:proofErr w:type="gramEnd"/>
-      <w:r>
-        <w:rPr>
-          <w:b/>
-          <w:bCs/>
-        </w:rPr>
-        <w:t xml:space="preserve"> those which are already incorporated in your book’s version and date)</w:t>
+        <w:t>(ignore those which are already incorporated in your book’s version and date)</w:t>
       </w:r>
     </w:p>
     <w:tbl>
@@ -10942,7 +11677,7 @@
 </file>
 
 <file path=word/endnotes.xml><?xml version="1.0" encoding="utf-8"?>
-<w:endnotes xmlns:wpc="http://schemas.microsoft.com/office/word/2010/wordprocessingCanvas" xmlns:cx="http://schemas.microsoft.com/office/drawing/2014/chartex" xmlns:cx1="http://schemas.microsoft.com/office/drawing/2015/9/8/chartex" xmlns:cx2="http://schemas.microsoft.com/office/drawing/2015/10/21/chartex" xmlns:cx3="http://schemas.microsoft.com/office/drawing/2016/5/9/chartex" xmlns:cx4="http://schemas.microsoft.com/office/drawing/2016/5/10/chartex" xmlns:cx5="http://schemas.microsoft.com/office/drawing/2016/5/11/chartex" xmlns:cx6="http://schemas.microsoft.com/office/drawing/2016/5/12/chartex" xmlns:cx7="http://schemas.microsoft.com/office/drawing/2016/5/13/chartex" xmlns:cx8="http://schemas.microsoft.com/office/drawing/2016/5/14/chartex" xmlns:mc="http://schemas.openxmlformats.org/markup-compatibility/2006" xmlns:aink="http://schemas.microsoft.com/office/drawing/2016/ink" xmlns:am3d="http://schemas.microsoft.com/office/drawing/2017/model3d" xmlns:o="urn:schemas-microsoft-com:office:office" xmlns:oel="http://schemas.microsoft.com/office/2019/extlst" xmlns:r="http://schemas.openxmlformats.org/officeDocument/2006/relationships" xmlns:m="http://schemas.openxmlformats.org/officeDocument/2006/math" xmlns:v="urn:schemas-microsoft-com:vml" xmlns:wp14="http://schemas.microsoft.com/office/word/2010/wordprocessingDrawing" xmlns:wp="http://schemas.openxmlformats.org/drawingml/2006/wordprocessingDrawing" xmlns:w10="urn:schemas-microsoft-com:office:word" xmlns:w="http://schemas.openxmlformats.org/wordprocessingml/2006/main" xmlns:w14="http://schemas.microsoft.com/office/word/2010/wordml" xmlns:w15="http://schemas.microsoft.com/office/word/2012/wordml" xmlns:w16cex="http://schemas.microsoft.com/office/word/2018/wordml/cex" xmlns:w16cid="http://schemas.microsoft.com/office/word/2016/wordml/cid" xmlns:w16="http://schemas.microsoft.com/office/word/2018/wordml" xmlns:w16sdtdh="http://schemas.microsoft.com/office/word/2020/wordml/sdtdatahash" xmlns:w16se="http://schemas.microsoft.com/office/word/2015/wordml/symex" xmlns:wpg="http://schemas.microsoft.com/office/word/2010/wordprocessingGroup" xmlns:wpi="http://schemas.microsoft.com/office/word/2010/wordprocessingInk" xmlns:wne="http://schemas.microsoft.com/office/word/2006/wordml" xmlns:wps="http://schemas.microsoft.com/office/word/2010/wordprocessingShape" mc:Ignorable="w14 w15 w16se w16cid w16 w16cex w16sdtdh wp14">
+<w:endnotes xmlns:wpc="http://schemas.microsoft.com/office/word/2010/wordprocessingCanvas" xmlns:cx="http://schemas.microsoft.com/office/drawing/2014/chartex" xmlns:cx1="http://schemas.microsoft.com/office/drawing/2015/9/8/chartex" xmlns:cx2="http://schemas.microsoft.com/office/drawing/2015/10/21/chartex" xmlns:cx3="http://schemas.microsoft.com/office/drawing/2016/5/9/chartex" xmlns:cx4="http://schemas.microsoft.com/office/drawing/2016/5/10/chartex" xmlns:cx5="http://schemas.microsoft.com/office/drawing/2016/5/11/chartex" xmlns:cx6="http://schemas.microsoft.com/office/drawing/2016/5/12/chartex" xmlns:cx7="http://schemas.microsoft.com/office/drawing/2016/5/13/chartex" xmlns:cx8="http://schemas.microsoft.com/office/drawing/2016/5/14/chartex" xmlns:mc="http://schemas.openxmlformats.org/markup-compatibility/2006" xmlns:aink="http://schemas.microsoft.com/office/drawing/2016/ink" xmlns:am3d="http://schemas.microsoft.com/office/drawing/2017/model3d" xmlns:o="urn:schemas-microsoft-com:office:office" xmlns:oel="http://schemas.microsoft.com/office/2019/extlst" xmlns:r="http://schemas.openxmlformats.org/officeDocument/2006/relationships" xmlns:m="http://schemas.openxmlformats.org/officeDocument/2006/math" xmlns:v="urn:schemas-microsoft-com:vml" xmlns:wp14="http://schemas.microsoft.com/office/word/2010/wordprocessingDrawing" xmlns:wp="http://schemas.openxmlformats.org/drawingml/2006/wordprocessingDrawing" xmlns:w10="urn:schemas-microsoft-com:office:word" xmlns:w="http://schemas.openxmlformats.org/wordprocessingml/2006/main" xmlns:w14="http://schemas.microsoft.com/office/word/2010/wordml" xmlns:w15="http://schemas.microsoft.com/office/word/2012/wordml" xmlns:w16cex="http://schemas.microsoft.com/office/word/2018/wordml/cex" xmlns:w16cid="http://schemas.microsoft.com/office/word/2016/wordml/cid" xmlns:w16="http://schemas.microsoft.com/office/word/2018/wordml" xmlns:w16du="http://schemas.microsoft.com/office/word/2023/wordml/word16du" xmlns:w16sdtdh="http://schemas.microsoft.com/office/word/2020/wordml/sdtdatahash" xmlns:w16sdtfl="http://schemas.microsoft.com/office/word/2024/wordml/sdtformatlock" xmlns:w16se="http://schemas.microsoft.com/office/word/2015/wordml/symex" xmlns:wpg="http://schemas.microsoft.com/office/word/2010/wordprocessingGroup" xmlns:wpi="http://schemas.microsoft.com/office/word/2010/wordprocessingInk" xmlns:wne="http://schemas.microsoft.com/office/word/2006/wordml" xmlns:wps="http://schemas.microsoft.com/office/word/2010/wordprocessingShape" mc:Ignorable="w14 w15 w16se w16cid w16 w16cex w16sdtdh w16sdtfl w16du wp14">
   <w:endnote w:type="separator" w:id="-1">
     <w:p>
       <w:pPr>
@@ -10967,7 +11702,7 @@
 </file>
 
 <file path=word/footer1.xml><?xml version="1.0" encoding="utf-8"?>
-<w:ftr xmlns:wpc="http://schemas.microsoft.com/office/word/2010/wordprocessingCanvas" xmlns:cx="http://schemas.microsoft.com/office/drawing/2014/chartex" xmlns:cx1="http://schemas.microsoft.com/office/drawing/2015/9/8/chartex" xmlns:cx2="http://schemas.microsoft.com/office/drawing/2015/10/21/chartex" xmlns:cx3="http://schemas.microsoft.com/office/drawing/2016/5/9/chartex" xmlns:cx4="http://schemas.microsoft.com/office/drawing/2016/5/10/chartex" xmlns:cx5="http://schemas.microsoft.com/office/drawing/2016/5/11/chartex" xmlns:cx6="http://schemas.microsoft.com/office/drawing/2016/5/12/chartex" xmlns:cx7="http://schemas.microsoft.com/office/drawing/2016/5/13/chartex" xmlns:cx8="http://schemas.microsoft.com/office/drawing/2016/5/14/chartex" xmlns:mc="http://schemas.openxmlformats.org/markup-compatibility/2006" xmlns:aink="http://schemas.microsoft.com/office/drawing/2016/ink" xmlns:am3d="http://schemas.microsoft.com/office/drawing/2017/model3d" xmlns:o="urn:schemas-microsoft-com:office:office" xmlns:oel="http://schemas.microsoft.com/office/2019/extlst" xmlns:r="http://schemas.openxmlformats.org/officeDocument/2006/relationships" xmlns:m="http://schemas.openxmlformats.org/officeDocument/2006/math" xmlns:v="urn:schemas-microsoft-com:vml" xmlns:wp14="http://schemas.microsoft.com/office/word/2010/wordprocessingDrawing" xmlns:wp="http://schemas.openxmlformats.org/drawingml/2006/wordprocessingDrawing" xmlns:w10="urn:schemas-microsoft-com:office:word" xmlns:w="http://schemas.openxmlformats.org/wordprocessingml/2006/main" xmlns:w14="http://schemas.microsoft.com/office/word/2010/wordml" xmlns:w15="http://schemas.microsoft.com/office/word/2012/wordml" xmlns:w16cex="http://schemas.microsoft.com/office/word/2018/wordml/cex" xmlns:w16cid="http://schemas.microsoft.com/office/word/2016/wordml/cid" xmlns:w16="http://schemas.microsoft.com/office/word/2018/wordml" xmlns:w16sdtdh="http://schemas.microsoft.com/office/word/2020/wordml/sdtdatahash" xmlns:w16se="http://schemas.microsoft.com/office/word/2015/wordml/symex" xmlns:wpg="http://schemas.microsoft.com/office/word/2010/wordprocessingGroup" xmlns:wpi="http://schemas.microsoft.com/office/word/2010/wordprocessingInk" xmlns:wne="http://schemas.microsoft.com/office/word/2006/wordml" xmlns:wps="http://schemas.microsoft.com/office/word/2010/wordprocessingShape" mc:Ignorable="w14 w15 w16se w16cid w16 w16cex w16sdtdh wp14">
+<w:ftr xmlns:wpc="http://schemas.microsoft.com/office/word/2010/wordprocessingCanvas" xmlns:cx="http://schemas.microsoft.com/office/drawing/2014/chartex" xmlns:cx1="http://schemas.microsoft.com/office/drawing/2015/9/8/chartex" xmlns:cx2="http://schemas.microsoft.com/office/drawing/2015/10/21/chartex" xmlns:cx3="http://schemas.microsoft.com/office/drawing/2016/5/9/chartex" xmlns:cx4="http://schemas.microsoft.com/office/drawing/2016/5/10/chartex" xmlns:cx5="http://schemas.microsoft.com/office/drawing/2016/5/11/chartex" xmlns:cx6="http://schemas.microsoft.com/office/drawing/2016/5/12/chartex" xmlns:cx7="http://schemas.microsoft.com/office/drawing/2016/5/13/chartex" xmlns:cx8="http://schemas.microsoft.com/office/drawing/2016/5/14/chartex" xmlns:mc="http://schemas.openxmlformats.org/markup-compatibility/2006" xmlns:aink="http://schemas.microsoft.com/office/drawing/2016/ink" xmlns:am3d="http://schemas.microsoft.com/office/drawing/2017/model3d" xmlns:o="urn:schemas-microsoft-com:office:office" xmlns:oel="http://schemas.microsoft.com/office/2019/extlst" xmlns:r="http://schemas.openxmlformats.org/officeDocument/2006/relationships" xmlns:m="http://schemas.openxmlformats.org/officeDocument/2006/math" xmlns:v="urn:schemas-microsoft-com:vml" xmlns:wp14="http://schemas.microsoft.com/office/word/2010/wordprocessingDrawing" xmlns:wp="http://schemas.openxmlformats.org/drawingml/2006/wordprocessingDrawing" xmlns:w10="urn:schemas-microsoft-com:office:word" xmlns:w="http://schemas.openxmlformats.org/wordprocessingml/2006/main" xmlns:w14="http://schemas.microsoft.com/office/word/2010/wordml" xmlns:w15="http://schemas.microsoft.com/office/word/2012/wordml" xmlns:w16cex="http://schemas.microsoft.com/office/word/2018/wordml/cex" xmlns:w16cid="http://schemas.microsoft.com/office/word/2016/wordml/cid" xmlns:w16="http://schemas.microsoft.com/office/word/2018/wordml" xmlns:w16du="http://schemas.microsoft.com/office/word/2023/wordml/word16du" xmlns:w16sdtdh="http://schemas.microsoft.com/office/word/2020/wordml/sdtdatahash" xmlns:w16sdtfl="http://schemas.microsoft.com/office/word/2024/wordml/sdtformatlock" xmlns:w16se="http://schemas.microsoft.com/office/word/2015/wordml/symex" xmlns:wpg="http://schemas.microsoft.com/office/word/2010/wordprocessingGroup" xmlns:wpi="http://schemas.microsoft.com/office/word/2010/wordprocessingInk" xmlns:wne="http://schemas.microsoft.com/office/word/2006/wordml" xmlns:wps="http://schemas.microsoft.com/office/word/2010/wordprocessingShape" mc:Ignorable="w14 w15 w16se w16cid w16 w16cex w16sdtdh w16sdtfl w16du wp14">
   <w:p>
     <w:pPr>
       <w:pBdr>
@@ -11152,7 +11887,7 @@
 </file>
 
 <file path=word/footer2.xml><?xml version="1.0" encoding="utf-8"?>
-<w:ftr xmlns:wpc="http://schemas.microsoft.com/office/word/2010/wordprocessingCanvas" xmlns:cx="http://schemas.microsoft.com/office/drawing/2014/chartex" xmlns:cx1="http://schemas.microsoft.com/office/drawing/2015/9/8/chartex" xmlns:cx2="http://schemas.microsoft.com/office/drawing/2015/10/21/chartex" xmlns:cx3="http://schemas.microsoft.com/office/drawing/2016/5/9/chartex" xmlns:cx4="http://schemas.microsoft.com/office/drawing/2016/5/10/chartex" xmlns:cx5="http://schemas.microsoft.com/office/drawing/2016/5/11/chartex" xmlns:cx6="http://schemas.microsoft.com/office/drawing/2016/5/12/chartex" xmlns:cx7="http://schemas.microsoft.com/office/drawing/2016/5/13/chartex" xmlns:cx8="http://schemas.microsoft.com/office/drawing/2016/5/14/chartex" xmlns:mc="http://schemas.openxmlformats.org/markup-compatibility/2006" xmlns:aink="http://schemas.microsoft.com/office/drawing/2016/ink" xmlns:am3d="http://schemas.microsoft.com/office/drawing/2017/model3d" xmlns:o="urn:schemas-microsoft-com:office:office" xmlns:oel="http://schemas.microsoft.com/office/2019/extlst" xmlns:r="http://schemas.openxmlformats.org/officeDocument/2006/relationships" xmlns:m="http://schemas.openxmlformats.org/officeDocument/2006/math" xmlns:v="urn:schemas-microsoft-com:vml" xmlns:wp14="http://schemas.microsoft.com/office/word/2010/wordprocessingDrawing" xmlns:wp="http://schemas.openxmlformats.org/drawingml/2006/wordprocessingDrawing" xmlns:w10="urn:schemas-microsoft-com:office:word" xmlns:w="http://schemas.openxmlformats.org/wordprocessingml/2006/main" xmlns:w14="http://schemas.microsoft.com/office/word/2010/wordml" xmlns:w15="http://schemas.microsoft.com/office/word/2012/wordml" xmlns:w16cex="http://schemas.microsoft.com/office/word/2018/wordml/cex" xmlns:w16cid="http://schemas.microsoft.com/office/word/2016/wordml/cid" xmlns:w16="http://schemas.microsoft.com/office/word/2018/wordml" xmlns:w16sdtdh="http://schemas.microsoft.com/office/word/2020/wordml/sdtdatahash" xmlns:w16se="http://schemas.microsoft.com/office/word/2015/wordml/symex" xmlns:wpg="http://schemas.microsoft.com/office/word/2010/wordprocessingGroup" xmlns:wpi="http://schemas.microsoft.com/office/word/2010/wordprocessingInk" xmlns:wne="http://schemas.microsoft.com/office/word/2006/wordml" xmlns:wps="http://schemas.microsoft.com/office/word/2010/wordprocessingShape" mc:Ignorable="w14 w15 w16se w16cid w16 w16cex w16sdtdh wp14">
+<w:ftr xmlns:wpc="http://schemas.microsoft.com/office/word/2010/wordprocessingCanvas" xmlns:cx="http://schemas.microsoft.com/office/drawing/2014/chartex" xmlns:cx1="http://schemas.microsoft.com/office/drawing/2015/9/8/chartex" xmlns:cx2="http://schemas.microsoft.com/office/drawing/2015/10/21/chartex" xmlns:cx3="http://schemas.microsoft.com/office/drawing/2016/5/9/chartex" xmlns:cx4="http://schemas.microsoft.com/office/drawing/2016/5/10/chartex" xmlns:cx5="http://schemas.microsoft.com/office/drawing/2016/5/11/chartex" xmlns:cx6="http://schemas.microsoft.com/office/drawing/2016/5/12/chartex" xmlns:cx7="http://schemas.microsoft.com/office/drawing/2016/5/13/chartex" xmlns:cx8="http://schemas.microsoft.com/office/drawing/2016/5/14/chartex" xmlns:mc="http://schemas.openxmlformats.org/markup-compatibility/2006" xmlns:aink="http://schemas.microsoft.com/office/drawing/2016/ink" xmlns:am3d="http://schemas.microsoft.com/office/drawing/2017/model3d" xmlns:o="urn:schemas-microsoft-com:office:office" xmlns:oel="http://schemas.microsoft.com/office/2019/extlst" xmlns:r="http://schemas.openxmlformats.org/officeDocument/2006/relationships" xmlns:m="http://schemas.openxmlformats.org/officeDocument/2006/math" xmlns:v="urn:schemas-microsoft-com:vml" xmlns:wp14="http://schemas.microsoft.com/office/word/2010/wordprocessingDrawing" xmlns:wp="http://schemas.openxmlformats.org/drawingml/2006/wordprocessingDrawing" xmlns:w10="urn:schemas-microsoft-com:office:word" xmlns:w="http://schemas.openxmlformats.org/wordprocessingml/2006/main" xmlns:w14="http://schemas.microsoft.com/office/word/2010/wordml" xmlns:w15="http://schemas.microsoft.com/office/word/2012/wordml" xmlns:w16cex="http://schemas.microsoft.com/office/word/2018/wordml/cex" xmlns:w16cid="http://schemas.microsoft.com/office/word/2016/wordml/cid" xmlns:w16="http://schemas.microsoft.com/office/word/2018/wordml" xmlns:w16du="http://schemas.microsoft.com/office/word/2023/wordml/word16du" xmlns:w16sdtdh="http://schemas.microsoft.com/office/word/2020/wordml/sdtdatahash" xmlns:w16sdtfl="http://schemas.microsoft.com/office/word/2024/wordml/sdtformatlock" xmlns:w16se="http://schemas.microsoft.com/office/word/2015/wordml/symex" xmlns:wpg="http://schemas.microsoft.com/office/word/2010/wordprocessingGroup" xmlns:wpi="http://schemas.microsoft.com/office/word/2010/wordprocessingInk" xmlns:wne="http://schemas.microsoft.com/office/word/2006/wordml" xmlns:wps="http://schemas.microsoft.com/office/word/2010/wordprocessingShape" mc:Ignorable="w14 w15 w16se w16cid w16 w16cex w16sdtdh w16sdtfl w16du wp14">
   <w:p>
     <w:pPr>
       <w:pBdr>
@@ -11372,7 +12107,7 @@
 </file>
 
 <file path=word/footnotes.xml><?xml version="1.0" encoding="utf-8"?>
-<w:footnotes xmlns:wpc="http://schemas.microsoft.com/office/word/2010/wordprocessingCanvas" xmlns:cx="http://schemas.microsoft.com/office/drawing/2014/chartex" xmlns:cx1="http://schemas.microsoft.com/office/drawing/2015/9/8/chartex" xmlns:cx2="http://schemas.microsoft.com/office/drawing/2015/10/21/chartex" xmlns:cx3="http://schemas.microsoft.com/office/drawing/2016/5/9/chartex" xmlns:cx4="http://schemas.microsoft.com/office/drawing/2016/5/10/chartex" xmlns:cx5="http://schemas.microsoft.com/office/drawing/2016/5/11/chartex" xmlns:cx6="http://schemas.microsoft.com/office/drawing/2016/5/12/chartex" xmlns:cx7="http://schemas.microsoft.com/office/drawing/2016/5/13/chartex" xmlns:cx8="http://schemas.microsoft.com/office/drawing/2016/5/14/chartex" xmlns:mc="http://schemas.openxmlformats.org/markup-compatibility/2006" xmlns:aink="http://schemas.microsoft.com/office/drawing/2016/ink" xmlns:am3d="http://schemas.microsoft.com/office/drawing/2017/model3d" xmlns:o="urn:schemas-microsoft-com:office:office" xmlns:oel="http://schemas.microsoft.com/office/2019/extlst" xmlns:r="http://schemas.openxmlformats.org/officeDocument/2006/relationships" xmlns:m="http://schemas.openxmlformats.org/officeDocument/2006/math" xmlns:v="urn:schemas-microsoft-com:vml" xmlns:wp14="http://schemas.microsoft.com/office/word/2010/wordprocessingDrawing" xmlns:wp="http://schemas.openxmlformats.org/drawingml/2006/wordprocessingDrawing" xmlns:w10="urn:schemas-microsoft-com:office:word" xmlns:w="http://schemas.openxmlformats.org/wordprocessingml/2006/main" xmlns:w14="http://schemas.microsoft.com/office/word/2010/wordml" xmlns:w15="http://schemas.microsoft.com/office/word/2012/wordml" xmlns:w16cex="http://schemas.microsoft.com/office/word/2018/wordml/cex" xmlns:w16cid="http://schemas.microsoft.com/office/word/2016/wordml/cid" xmlns:w16="http://schemas.microsoft.com/office/word/2018/wordml" xmlns:w16sdtdh="http://schemas.microsoft.com/office/word/2020/wordml/sdtdatahash" xmlns:w16se="http://schemas.microsoft.com/office/word/2015/wordml/symex" xmlns:wpg="http://schemas.microsoft.com/office/word/2010/wordprocessingGroup" xmlns:wpi="http://schemas.microsoft.com/office/word/2010/wordprocessingInk" xmlns:wne="http://schemas.microsoft.com/office/word/2006/wordml" xmlns:wps="http://schemas.microsoft.com/office/word/2010/wordprocessingShape" mc:Ignorable="w14 w15 w16se w16cid w16 w16cex w16sdtdh wp14">
+<w:footnotes xmlns:wpc="http://schemas.microsoft.com/office/word/2010/wordprocessingCanvas" xmlns:cx="http://schemas.microsoft.com/office/drawing/2014/chartex" xmlns:cx1="http://schemas.microsoft.com/office/drawing/2015/9/8/chartex" xmlns:cx2="http://schemas.microsoft.com/office/drawing/2015/10/21/chartex" xmlns:cx3="http://schemas.microsoft.com/office/drawing/2016/5/9/chartex" xmlns:cx4="http://schemas.microsoft.com/office/drawing/2016/5/10/chartex" xmlns:cx5="http://schemas.microsoft.com/office/drawing/2016/5/11/chartex" xmlns:cx6="http://schemas.microsoft.com/office/drawing/2016/5/12/chartex" xmlns:cx7="http://schemas.microsoft.com/office/drawing/2016/5/13/chartex" xmlns:cx8="http://schemas.microsoft.com/office/drawing/2016/5/14/chartex" xmlns:mc="http://schemas.openxmlformats.org/markup-compatibility/2006" xmlns:aink="http://schemas.microsoft.com/office/drawing/2016/ink" xmlns:am3d="http://schemas.microsoft.com/office/drawing/2017/model3d" xmlns:o="urn:schemas-microsoft-com:office:office" xmlns:oel="http://schemas.microsoft.com/office/2019/extlst" xmlns:r="http://schemas.openxmlformats.org/officeDocument/2006/relationships" xmlns:m="http://schemas.openxmlformats.org/officeDocument/2006/math" xmlns:v="urn:schemas-microsoft-com:vml" xmlns:wp14="http://schemas.microsoft.com/office/word/2010/wordprocessingDrawing" xmlns:wp="http://schemas.openxmlformats.org/drawingml/2006/wordprocessingDrawing" xmlns:w10="urn:schemas-microsoft-com:office:word" xmlns:w="http://schemas.openxmlformats.org/wordprocessingml/2006/main" xmlns:w14="http://schemas.microsoft.com/office/word/2010/wordml" xmlns:w15="http://schemas.microsoft.com/office/word/2012/wordml" xmlns:w16cex="http://schemas.microsoft.com/office/word/2018/wordml/cex" xmlns:w16cid="http://schemas.microsoft.com/office/word/2016/wordml/cid" xmlns:w16="http://schemas.microsoft.com/office/word/2018/wordml" xmlns:w16du="http://schemas.microsoft.com/office/word/2023/wordml/word16du" xmlns:w16sdtdh="http://schemas.microsoft.com/office/word/2020/wordml/sdtdatahash" xmlns:w16sdtfl="http://schemas.microsoft.com/office/word/2024/wordml/sdtformatlock" xmlns:w16se="http://schemas.microsoft.com/office/word/2015/wordml/symex" xmlns:wpg="http://schemas.microsoft.com/office/word/2010/wordprocessingGroup" xmlns:wpi="http://schemas.microsoft.com/office/word/2010/wordprocessingInk" xmlns:wne="http://schemas.microsoft.com/office/word/2006/wordml" xmlns:wps="http://schemas.microsoft.com/office/word/2010/wordprocessingShape" mc:Ignorable="w14 w15 w16se w16cid w16 w16cex w16sdtdh w16sdtfl w16du wp14">
   <w:footnote w:type="separator" w:id="-1">
     <w:p>
       <w:pPr>
@@ -11397,7 +12132,7 @@
 </file>
 
 <file path=word/header1.xml><?xml version="1.0" encoding="utf-8"?>
-<w:hdr xmlns:wpc="http://schemas.microsoft.com/office/word/2010/wordprocessingCanvas" xmlns:cx="http://schemas.microsoft.com/office/drawing/2014/chartex" xmlns:cx1="http://schemas.microsoft.com/office/drawing/2015/9/8/chartex" xmlns:cx2="http://schemas.microsoft.com/office/drawing/2015/10/21/chartex" xmlns:cx3="http://schemas.microsoft.com/office/drawing/2016/5/9/chartex" xmlns:cx4="http://schemas.microsoft.com/office/drawing/2016/5/10/chartex" xmlns:cx5="http://schemas.microsoft.com/office/drawing/2016/5/11/chartex" xmlns:cx6="http://schemas.microsoft.com/office/drawing/2016/5/12/chartex" xmlns:cx7="http://schemas.microsoft.com/office/drawing/2016/5/13/chartex" xmlns:cx8="http://schemas.microsoft.com/office/drawing/2016/5/14/chartex" xmlns:mc="http://schemas.openxmlformats.org/markup-compatibility/2006" xmlns:aink="http://schemas.microsoft.com/office/drawing/2016/ink" xmlns:am3d="http://schemas.microsoft.com/office/drawing/2017/model3d" xmlns:o="urn:schemas-microsoft-com:office:office" xmlns:oel="http://schemas.microsoft.com/office/2019/extlst" xmlns:r="http://schemas.openxmlformats.org/officeDocument/2006/relationships" xmlns:m="http://schemas.openxmlformats.org/officeDocument/2006/math" xmlns:v="urn:schemas-microsoft-com:vml" xmlns:wp14="http://schemas.microsoft.com/office/word/2010/wordprocessingDrawing" xmlns:wp="http://schemas.openxmlformats.org/drawingml/2006/wordprocessingDrawing" xmlns:w10="urn:schemas-microsoft-com:office:word" xmlns:w="http://schemas.openxmlformats.org/wordprocessingml/2006/main" xmlns:w14="http://schemas.microsoft.com/office/word/2010/wordml" xmlns:w15="http://schemas.microsoft.com/office/word/2012/wordml" xmlns:w16cex="http://schemas.microsoft.com/office/word/2018/wordml/cex" xmlns:w16cid="http://schemas.microsoft.com/office/word/2016/wordml/cid" xmlns:w16="http://schemas.microsoft.com/office/word/2018/wordml" xmlns:w16sdtdh="http://schemas.microsoft.com/office/word/2020/wordml/sdtdatahash" xmlns:w16se="http://schemas.microsoft.com/office/word/2015/wordml/symex" xmlns:wpg="http://schemas.microsoft.com/office/word/2010/wordprocessingGroup" xmlns:wpi="http://schemas.microsoft.com/office/word/2010/wordprocessingInk" xmlns:wne="http://schemas.microsoft.com/office/word/2006/wordml" xmlns:wps="http://schemas.microsoft.com/office/word/2010/wordprocessingShape" mc:Ignorable="w14 w15 w16se w16cid w16 w16cex w16sdtdh wp14">
+<w:hdr xmlns:wpc="http://schemas.microsoft.com/office/word/2010/wordprocessingCanvas" xmlns:cx="http://schemas.microsoft.com/office/drawing/2014/chartex" xmlns:cx1="http://schemas.microsoft.com/office/drawing/2015/9/8/chartex" xmlns:cx2="http://schemas.microsoft.com/office/drawing/2015/10/21/chartex" xmlns:cx3="http://schemas.microsoft.com/office/drawing/2016/5/9/chartex" xmlns:cx4="http://schemas.microsoft.com/office/drawing/2016/5/10/chartex" xmlns:cx5="http://schemas.microsoft.com/office/drawing/2016/5/11/chartex" xmlns:cx6="http://schemas.microsoft.com/office/drawing/2016/5/12/chartex" xmlns:cx7="http://schemas.microsoft.com/office/drawing/2016/5/13/chartex" xmlns:cx8="http://schemas.microsoft.com/office/drawing/2016/5/14/chartex" xmlns:mc="http://schemas.openxmlformats.org/markup-compatibility/2006" xmlns:aink="http://schemas.microsoft.com/office/drawing/2016/ink" xmlns:am3d="http://schemas.microsoft.com/office/drawing/2017/model3d" xmlns:o="urn:schemas-microsoft-com:office:office" xmlns:oel="http://schemas.microsoft.com/office/2019/extlst" xmlns:r="http://schemas.openxmlformats.org/officeDocument/2006/relationships" xmlns:m="http://schemas.openxmlformats.org/officeDocument/2006/math" xmlns:v="urn:schemas-microsoft-com:vml" xmlns:wp14="http://schemas.microsoft.com/office/word/2010/wordprocessingDrawing" xmlns:wp="http://schemas.openxmlformats.org/drawingml/2006/wordprocessingDrawing" xmlns:w10="urn:schemas-microsoft-com:office:word" xmlns:w="http://schemas.openxmlformats.org/wordprocessingml/2006/main" xmlns:w14="http://schemas.microsoft.com/office/word/2010/wordml" xmlns:w15="http://schemas.microsoft.com/office/word/2012/wordml" xmlns:w16cex="http://schemas.microsoft.com/office/word/2018/wordml/cex" xmlns:w16cid="http://schemas.microsoft.com/office/word/2016/wordml/cid" xmlns:w16="http://schemas.microsoft.com/office/word/2018/wordml" xmlns:w16du="http://schemas.microsoft.com/office/word/2023/wordml/word16du" xmlns:w16sdtdh="http://schemas.microsoft.com/office/word/2020/wordml/sdtdatahash" xmlns:w16sdtfl="http://schemas.microsoft.com/office/word/2024/wordml/sdtformatlock" xmlns:w16se="http://schemas.microsoft.com/office/word/2015/wordml/symex" xmlns:wpg="http://schemas.microsoft.com/office/word/2010/wordprocessingGroup" xmlns:wpi="http://schemas.microsoft.com/office/word/2010/wordprocessingInk" xmlns:wne="http://schemas.microsoft.com/office/word/2006/wordml" xmlns:wps="http://schemas.microsoft.com/office/word/2010/wordprocessingShape" mc:Ignorable="w14 w15 w16se w16cid w16 w16cex w16sdtdh w16sdtfl w16du wp14">
   <w:p>
     <w:pPr>
       <w:pStyle w:val="Header"/>
@@ -11410,7 +12145,7 @@
 </file>
 
 <file path=word/header2.xml><?xml version="1.0" encoding="utf-8"?>
-<w:hdr xmlns:wpc="http://schemas.microsoft.com/office/word/2010/wordprocessingCanvas" xmlns:cx="http://schemas.microsoft.com/office/drawing/2014/chartex" xmlns:cx1="http://schemas.microsoft.com/office/drawing/2015/9/8/chartex" xmlns:cx2="http://schemas.microsoft.com/office/drawing/2015/10/21/chartex" xmlns:cx3="http://schemas.microsoft.com/office/drawing/2016/5/9/chartex" xmlns:cx4="http://schemas.microsoft.com/office/drawing/2016/5/10/chartex" xmlns:cx5="http://schemas.microsoft.com/office/drawing/2016/5/11/chartex" xmlns:cx6="http://schemas.microsoft.com/office/drawing/2016/5/12/chartex" xmlns:cx7="http://schemas.microsoft.com/office/drawing/2016/5/13/chartex" xmlns:cx8="http://schemas.microsoft.com/office/drawing/2016/5/14/chartex" xmlns:mc="http://schemas.openxmlformats.org/markup-compatibility/2006" xmlns:aink="http://schemas.microsoft.com/office/drawing/2016/ink" xmlns:am3d="http://schemas.microsoft.com/office/drawing/2017/model3d" xmlns:o="urn:schemas-microsoft-com:office:office" xmlns:oel="http://schemas.microsoft.com/office/2019/extlst" xmlns:r="http://schemas.openxmlformats.org/officeDocument/2006/relationships" xmlns:m="http://schemas.openxmlformats.org/officeDocument/2006/math" xmlns:v="urn:schemas-microsoft-com:vml" xmlns:wp14="http://schemas.microsoft.com/office/word/2010/wordprocessingDrawing" xmlns:wp="http://schemas.openxmlformats.org/drawingml/2006/wordprocessingDrawing" xmlns:w10="urn:schemas-microsoft-com:office:word" xmlns:w="http://schemas.openxmlformats.org/wordprocessingml/2006/main" xmlns:w14="http://schemas.microsoft.com/office/word/2010/wordml" xmlns:w15="http://schemas.microsoft.com/office/word/2012/wordml" xmlns:w16cex="http://schemas.microsoft.com/office/word/2018/wordml/cex" xmlns:w16cid="http://schemas.microsoft.com/office/word/2016/wordml/cid" xmlns:w16="http://schemas.microsoft.com/office/word/2018/wordml" xmlns:w16sdtdh="http://schemas.microsoft.com/office/word/2020/wordml/sdtdatahash" xmlns:w16se="http://schemas.microsoft.com/office/word/2015/wordml/symex" xmlns:wpg="http://schemas.microsoft.com/office/word/2010/wordprocessingGroup" xmlns:wpi="http://schemas.microsoft.com/office/word/2010/wordprocessingInk" xmlns:wne="http://schemas.microsoft.com/office/word/2006/wordml" xmlns:wps="http://schemas.microsoft.com/office/word/2010/wordprocessingShape" mc:Ignorable="w14 w15 w16se w16cid w16 w16cex w16sdtdh wp14">
+<w:hdr xmlns:wpc="http://schemas.microsoft.com/office/word/2010/wordprocessingCanvas" xmlns:cx="http://schemas.microsoft.com/office/drawing/2014/chartex" xmlns:cx1="http://schemas.microsoft.com/office/drawing/2015/9/8/chartex" xmlns:cx2="http://schemas.microsoft.com/office/drawing/2015/10/21/chartex" xmlns:cx3="http://schemas.microsoft.com/office/drawing/2016/5/9/chartex" xmlns:cx4="http://schemas.microsoft.com/office/drawing/2016/5/10/chartex" xmlns:cx5="http://schemas.microsoft.com/office/drawing/2016/5/11/chartex" xmlns:cx6="http://schemas.microsoft.com/office/drawing/2016/5/12/chartex" xmlns:cx7="http://schemas.microsoft.com/office/drawing/2016/5/13/chartex" xmlns:cx8="http://schemas.microsoft.com/office/drawing/2016/5/14/chartex" xmlns:mc="http://schemas.openxmlformats.org/markup-compatibility/2006" xmlns:aink="http://schemas.microsoft.com/office/drawing/2016/ink" xmlns:am3d="http://schemas.microsoft.com/office/drawing/2017/model3d" xmlns:o="urn:schemas-microsoft-com:office:office" xmlns:oel="http://schemas.microsoft.com/office/2019/extlst" xmlns:r="http://schemas.openxmlformats.org/officeDocument/2006/relationships" xmlns:m="http://schemas.openxmlformats.org/officeDocument/2006/math" xmlns:v="urn:schemas-microsoft-com:vml" xmlns:wp14="http://schemas.microsoft.com/office/word/2010/wordprocessingDrawing" xmlns:wp="http://schemas.openxmlformats.org/drawingml/2006/wordprocessingDrawing" xmlns:w10="urn:schemas-microsoft-com:office:word" xmlns:w="http://schemas.openxmlformats.org/wordprocessingml/2006/main" xmlns:w14="http://schemas.microsoft.com/office/word/2010/wordml" xmlns:w15="http://schemas.microsoft.com/office/word/2012/wordml" xmlns:w16cex="http://schemas.microsoft.com/office/word/2018/wordml/cex" xmlns:w16cid="http://schemas.microsoft.com/office/word/2016/wordml/cid" xmlns:w16="http://schemas.microsoft.com/office/word/2018/wordml" xmlns:w16du="http://schemas.microsoft.com/office/word/2023/wordml/word16du" xmlns:w16sdtdh="http://schemas.microsoft.com/office/word/2020/wordml/sdtdatahash" xmlns:w16sdtfl="http://schemas.microsoft.com/office/word/2024/wordml/sdtformatlock" xmlns:w16se="http://schemas.microsoft.com/office/word/2015/wordml/symex" xmlns:wpg="http://schemas.microsoft.com/office/word/2010/wordprocessingGroup" xmlns:wpi="http://schemas.microsoft.com/office/word/2010/wordprocessingInk" xmlns:wne="http://schemas.microsoft.com/office/word/2006/wordml" xmlns:wps="http://schemas.microsoft.com/office/word/2010/wordprocessingShape" mc:Ignorable="w14 w15 w16se w16cid w16 w16cex w16sdtdh w16sdtfl w16du wp14">
   <w:p>
     <w:pPr>
       <w:pStyle w:val="Header"/>
@@ -11423,7 +12158,7 @@
 </file>
 
 <file path=word/styles.xml><?xml version="1.0" encoding="utf-8"?>
-<w:styles xmlns:mc="http://schemas.openxmlformats.org/markup-compatibility/2006" xmlns:r="http://schemas.openxmlformats.org/officeDocument/2006/relationships" xmlns:w="http://schemas.openxmlformats.org/wordprocessingml/2006/main" xmlns:w14="http://schemas.microsoft.com/office/word/2010/wordml" xmlns:w15="http://schemas.microsoft.com/office/word/2012/wordml" xmlns:w16cex="http://schemas.microsoft.com/office/word/2018/wordml/cex" xmlns:w16cid="http://schemas.microsoft.com/office/word/2016/wordml/cid" xmlns:w16="http://schemas.microsoft.com/office/word/2018/wordml" xmlns:w16sdtdh="http://schemas.microsoft.com/office/word/2020/wordml/sdtdatahash" xmlns:w16se="http://schemas.microsoft.com/office/word/2015/wordml/symex" mc:Ignorable="w14 w15 w16se w16cid w16 w16cex w16sdtdh">
+<w:styles xmlns:mc="http://schemas.openxmlformats.org/markup-compatibility/2006" xmlns:r="http://schemas.openxmlformats.org/officeDocument/2006/relationships" xmlns:w="http://schemas.openxmlformats.org/wordprocessingml/2006/main" xmlns:w14="http://schemas.microsoft.com/office/word/2010/wordml" xmlns:w15="http://schemas.microsoft.com/office/word/2012/wordml" xmlns:w16cex="http://schemas.microsoft.com/office/word/2018/wordml/cex" xmlns:w16cid="http://schemas.microsoft.com/office/word/2016/wordml/cid" xmlns:w16="http://schemas.microsoft.com/office/word/2018/wordml" xmlns:w16du="http://schemas.microsoft.com/office/word/2023/wordml/word16du" xmlns:w16sdtdh="http://schemas.microsoft.com/office/word/2020/wordml/sdtdatahash" xmlns:w16sdtfl="http://schemas.microsoft.com/office/word/2024/wordml/sdtformatlock" xmlns:w16se="http://schemas.microsoft.com/office/word/2015/wordml/symex" mc:Ignorable="w14 w15 w16se w16cid w16 w16cex w16sdtdh w16sdtfl w16du">
   <w:docDefaults>
     <w:rPrDefault>
       <w:rPr>

</xml_diff>